<commit_message>
feat: add checkbox field type support to schema, forms, and CSV generation
</commit_message>
<xml_diff>
--- a/public/example-template.docx
+++ b/public/example-template.docx
@@ -374,6 +374,57 @@
           </w:p>
         </w:tc>
       </w:tr>
+      <w:tr>
+        <w:tc>
+          <w:tcPr>
+            <w:tcW w:type="dxa" w:w="4680"/>
+            <w:tcBorders>
+              <w:top w:val="single" w:color="D1D5DB" w:sz="4"/>
+              <w:left w:val="single" w:color="D1D5DB" w:sz="4"/>
+              <w:bottom w:val="single" w:color="D1D5DB" w:sz="4"/>
+              <w:right w:val="single" w:color="D1D5DB" w:sz="4"/>
+            </w:tcBorders>
+            <w:tcMar>
+              <w:top w:type="dxa" w:w="120"/>
+              <w:left w:type="dxa" w:w="160"/>
+              <w:bottom w:type="dxa" w:w="120"/>
+              <w:right w:type="dxa" w:w="160"/>
+            </w:tcMar>
+          </w:tcPr>
+          <w:p>
+            <w:r>
+              <w:rPr>
+                <w:rFonts w:ascii="Courier New" w:cs="Courier New" w:eastAsia="Courier New" w:hAnsi="Courier New"/>
+                <w:sz w:val="20"/>
+                <w:szCs w:val="20"/>
+              </w:rPr>
+              <w:t xml:space="preserve">{{terms_accepted|checkbox}}</w:t>
+            </w:r>
+          </w:p>
+        </w:tc>
+        <w:tc>
+          <w:tcPr>
+            <w:tcW w:type="dxa" w:w="4680"/>
+            <w:tcBorders>
+              <w:top w:val="single" w:color="D1D5DB" w:sz="4"/>
+              <w:left w:val="single" w:color="D1D5DB" w:sz="4"/>
+              <w:bottom w:val="single" w:color="D1D5DB" w:sz="4"/>
+              <w:right w:val="single" w:color="D1D5DB" w:sz="4"/>
+            </w:tcBorders>
+            <w:tcMar>
+              <w:top w:type="dxa" w:w="120"/>
+              <w:left w:type="dxa" w:w="160"/>
+              <w:bottom w:type="dxa" w:w="120"/>
+              <w:right w:type="dxa" w:w="160"/>
+            </w:tcMar>
+          </w:tcPr>
+          <w:p>
+            <w:r>
+              <w:t xml:space="preserve">☒</w:t>
+            </w:r>
+          </w:p>
+        </w:tc>
+      </w:tr>
     </w:tbl>
     <w:p/>
     <w:p>

</xml_diff>